<commit_message>
FD01 FD02 FD03 FD04
</commit_message>
<xml_diff>
--- a/docs/FD01-EPIS-Informe de Factibilidad.docx
+++ b/docs/FD01-EPIS-Informe de Factibilidad.docx
@@ -1818,7 +1818,7 @@
     </w:p>
     <w:sdt>
       <w:sdtPr>
-        <w:id w:val="-1097468913"/>
+        <w:id w:val="-1065609230"/>
         <w:docPartObj>
           <w:docPartGallery w:val="Table of Contents"/>
           <w:docPartUnique w:val="1"/>
@@ -4043,7 +4043,7 @@
     <w:sdt>
       <w:sdtPr>
         <w:lock w:val="contentLocked"/>
-        <w:id w:val="1447780863"/>
+        <w:id w:val="1425105901"/>
         <w:tag w:val="goog_rdk_0"/>
       </w:sdtPr>
       <w:sdtContent>
@@ -4689,7 +4689,7 @@
     <w:sdt>
       <w:sdtPr>
         <w:lock w:val="contentLocked"/>
-        <w:id w:val="-1800979267"/>
+        <w:id w:val="-1911492908"/>
         <w:tag w:val="goog_rdk_1"/>
       </w:sdtPr>
       <w:sdtContent>
@@ -5058,7 +5058,7 @@
     <w:sdt>
       <w:sdtPr>
         <w:lock w:val="contentLocked"/>
-        <w:id w:val="-645595108"/>
+        <w:id w:val="1101731207"/>
         <w:tag w:val="goog_rdk_2"/>
       </w:sdtPr>
       <w:sdtContent>
@@ -5578,7 +5578,7 @@
     <w:sdt>
       <w:sdtPr>
         <w:lock w:val="contentLocked"/>
-        <w:id w:val="502508454"/>
+        <w:id w:val="-1484734831"/>
         <w:tag w:val="goog_rdk_3"/>
       </w:sdtPr>
       <w:sdtContent>
@@ -6094,7 +6094,7 @@
     <w:sdt>
       <w:sdtPr>
         <w:lock w:val="contentLocked"/>
-        <w:id w:val="-1357382867"/>
+        <w:id w:val="-745464778"/>
         <w:tag w:val="goog_rdk_4"/>
       </w:sdtPr>
       <w:sdtContent>
@@ -6721,7 +6721,7 @@
     <w:sdt>
       <w:sdtPr>
         <w:lock w:val="contentLocked"/>
-        <w:id w:val="312365369"/>
+        <w:id w:val="-1907558692"/>
         <w:tag w:val="goog_rdk_5"/>
       </w:sdtPr>
       <w:sdtContent>
@@ -7362,7 +7362,7 @@
     <w:sdt>
       <w:sdtPr>
         <w:lock w:val="contentLocked"/>
-        <w:id w:val="692072666"/>
+        <w:id w:val="-340891121"/>
         <w:tag w:val="goog_rdk_6"/>
       </w:sdtPr>
       <w:sdtContent>
@@ -7779,7 +7779,7 @@
     <w:sdt>
       <w:sdtPr>
         <w:lock w:val="contentLocked"/>
-        <w:id w:val="-1888205753"/>
+        <w:id w:val="-440295649"/>
         <w:tag w:val="goog_rdk_7"/>
       </w:sdtPr>
       <w:sdtContent>
@@ -8370,7 +8370,7 @@
           <w:ilvl w:val="1"/>
           <w:numId w:val="4"/>
         </w:numPr>
-        <w:spacing w:after="0" w:afterAutospacing="0" w:line="480" w:lineRule="auto"/>
+        <w:spacing w:line="480" w:lineRule="auto"/>
         <w:ind w:left="1440" w:hanging="360"/>
         <w:rPr/>
       </w:pPr>
@@ -8381,33 +8381,12 @@
           <w:rtl w:val="0"/>
         </w:rPr>
         <w:t xml:space="preserve">Factibilidad Legal</w:t>
-      </w:r>
-    </w:p>
-    <w:p>
-      <w:pPr>
-        <w:pStyle w:val="Heading2"/>
-        <w:numPr>
-          <w:ilvl w:val="0"/>
-          <w:numId w:val="4"/>
-        </w:numPr>
-        <w:ind w:left="720" w:hanging="360"/>
-        <w:rPr>
-          <w:b w:val="1"/>
-          <w:bCs w:val="1"/>
-        </w:rPr>
-      </w:pPr>
-      <w:bookmarkStart w:colFirst="0" w:colLast="0" w:name="_heading=h.4bcugqslgy3w" w:id="24"/>
-      <w:bookmarkEnd w:id="24"/>
-      <w:r>
-        <w:rPr>
-          <w:rtl w:val="0"/>
-        </w:rPr>
       </w:r>
     </w:p>
     <w:sdt>
       <w:sdtPr>
         <w:lock w:val="contentLocked"/>
-        <w:id w:val="-1303114486"/>
+        <w:id w:val="-185831817"/>
         <w:tag w:val="goog_rdk_8"/>
       </w:sdtPr>
       <w:sdtContent>
@@ -8821,8 +8800,8 @@
         <w:ind w:left="1440" w:hanging="360"/>
         <w:rPr/>
       </w:pPr>
-      <w:bookmarkStart w:colFirst="0" w:colLast="0" w:name="_heading=h.8vxjlw5qxgzi" w:id="25"/>
-      <w:bookmarkEnd w:id="25"/>
+      <w:bookmarkStart w:colFirst="0" w:colLast="0" w:name="_heading=h.8vxjlw5qxgzi" w:id="24"/>
+      <w:bookmarkEnd w:id="24"/>
       <w:r>
         <w:rPr>
           <w:rtl w:val="0"/>
@@ -8833,7 +8812,7 @@
     <w:sdt>
       <w:sdtPr>
         <w:lock w:val="contentLocked"/>
-        <w:id w:val="-779210105"/>
+        <w:id w:val="1373166064"/>
         <w:tag w:val="goog_rdk_9"/>
       </w:sdtPr>
       <w:sdtContent>
@@ -9247,8 +9226,8 @@
         <w:ind w:left="1440" w:hanging="360"/>
         <w:rPr/>
       </w:pPr>
-      <w:bookmarkStart w:colFirst="0" w:colLast="0" w:name="_heading=h.fup6zg4p73d8" w:id="26"/>
-      <w:bookmarkEnd w:id="26"/>
+      <w:bookmarkStart w:colFirst="0" w:colLast="0" w:name="_heading=h.fup6zg4p73d8" w:id="25"/>
+      <w:bookmarkEnd w:id="25"/>
       <w:r>
         <w:rPr>
           <w:rtl w:val="0"/>
@@ -9259,7 +9238,7 @@
     <w:sdt>
       <w:sdtPr>
         <w:lock w:val="contentLocked"/>
-        <w:id w:val="-1692338849"/>
+        <w:id w:val="-1744786776"/>
         <w:tag w:val="goog_rdk_10"/>
       </w:sdtPr>
       <w:sdtContent>
@@ -9673,8 +9652,8 @@
         <w:ind w:left="720" w:hanging="360"/>
         <w:rPr/>
       </w:pPr>
-      <w:bookmarkStart w:colFirst="0" w:colLast="0" w:name="_heading=h.i4nci97w8t7h" w:id="27"/>
-      <w:bookmarkEnd w:id="27"/>
+      <w:bookmarkStart w:colFirst="0" w:colLast="0" w:name="_heading=h.i4nci97w8t7h" w:id="26"/>
+      <w:bookmarkEnd w:id="26"/>
       <w:r>
         <w:rPr>
           <w:rtl w:val="0"/>
@@ -9692,8 +9671,8 @@
         <w:spacing w:line="480" w:lineRule="auto"/>
         <w:ind w:left="1440" w:hanging="360"/>
       </w:pPr>
-      <w:bookmarkStart w:colFirst="0" w:colLast="0" w:name="_heading=h.u5s29t9sv8wb" w:id="28"/>
-      <w:bookmarkEnd w:id="28"/>
+      <w:bookmarkStart w:colFirst="0" w:colLast="0" w:name="_heading=h.u5s29t9sv8wb" w:id="27"/>
+      <w:bookmarkEnd w:id="27"/>
       <w:r>
         <w:rPr>
           <w:rtl w:val="0"/>
@@ -9803,8 +9782,8 @@
         <w:spacing w:line="480" w:lineRule="auto"/>
         <w:ind w:left="2160" w:hanging="360"/>
       </w:pPr>
-      <w:bookmarkStart w:colFirst="0" w:colLast="0" w:name="_heading=h.jizsj8jnk65r" w:id="29"/>
-      <w:bookmarkEnd w:id="29"/>
+      <w:bookmarkStart w:colFirst="0" w:colLast="0" w:name="_heading=h.jizsj8jnk65r" w:id="28"/>
+      <w:bookmarkEnd w:id="28"/>
       <w:r>
         <w:rPr>
           <w:rtl w:val="0"/>
@@ -9929,8 +9908,8 @@
         <w:spacing w:after="0" w:afterAutospacing="0" w:line="480" w:lineRule="auto"/>
         <w:ind w:left="2160" w:hanging="360"/>
       </w:pPr>
-      <w:bookmarkStart w:colFirst="0" w:colLast="0" w:name="_heading=h.6r8ai6rkleyr" w:id="30"/>
-      <w:bookmarkEnd w:id="30"/>
+      <w:bookmarkStart w:colFirst="0" w:colLast="0" w:name="_heading=h.6r8ai6rkleyr" w:id="29"/>
+      <w:bookmarkEnd w:id="29"/>
       <w:r>
         <w:rPr>
           <w:rtl w:val="0"/>
@@ -9948,8 +9927,8 @@
         <w:spacing w:line="480" w:lineRule="auto"/>
         <w:ind w:left="2880" w:hanging="360"/>
       </w:pPr>
-      <w:bookmarkStart w:colFirst="0" w:colLast="0" w:name="_heading=h.boxatcgm50sj" w:id="31"/>
-      <w:bookmarkEnd w:id="31"/>
+      <w:bookmarkStart w:colFirst="0" w:colLast="0" w:name="_heading=h.boxatcgm50sj" w:id="30"/>
+      <w:bookmarkEnd w:id="30"/>
       <w:r>
         <w:rPr>
           <w:rtl w:val="0"/>
@@ -9960,7 +9939,7 @@
     <w:sdt>
       <w:sdtPr>
         <w:lock w:val="contentLocked"/>
-        <w:id w:val="-605741395"/>
+        <w:id w:val="756625709"/>
         <w:tag w:val="goog_rdk_11"/>
       </w:sdtPr>
       <w:sdtContent>
@@ -10575,8 +10554,8 @@
         <w:spacing w:line="480" w:lineRule="auto"/>
         <w:ind w:left="2880" w:hanging="360"/>
       </w:pPr>
-      <w:bookmarkStart w:colFirst="0" w:colLast="0" w:name="_heading=h.afnk29q816v1" w:id="32"/>
-      <w:bookmarkEnd w:id="32"/>
+      <w:bookmarkStart w:colFirst="0" w:colLast="0" w:name="_heading=h.afnk29q816v1" w:id="31"/>
+      <w:bookmarkEnd w:id="31"/>
       <w:r>
         <w:rPr>
           <w:rtl w:val="0"/>
@@ -10650,8 +10629,8 @@
         <w:spacing w:line="480" w:lineRule="auto"/>
         <w:ind w:left="2880" w:hanging="360"/>
       </w:pPr>
-      <w:bookmarkStart w:colFirst="0" w:colLast="0" w:name="_heading=h.dlj8267i58e7" w:id="33"/>
-      <w:bookmarkEnd w:id="33"/>
+      <w:bookmarkStart w:colFirst="0" w:colLast="0" w:name="_heading=h.dlj8267i58e7" w:id="32"/>
+      <w:bookmarkEnd w:id="32"/>
       <w:r>
         <w:rPr>
           <w:rtl w:val="0"/>
@@ -10774,7 +10753,7 @@
       </w:pPr>
       <w:sdt>
         <w:sdtPr>
-          <w:id w:val="1978203449"/>
+          <w:id w:val="1075691465"/>
           <w:tag w:val="goog_rdk_12"/>
         </w:sdtPr>
         <w:sdtContent>
@@ -10799,8 +10778,8 @@
         <w:ind w:left="720" w:hanging="360"/>
         <w:rPr/>
       </w:pPr>
-      <w:bookmarkStart w:colFirst="0" w:colLast="0" w:name="_heading=h.kkx1tet3dg07" w:id="34"/>
-      <w:bookmarkEnd w:id="34"/>
+      <w:bookmarkStart w:colFirst="0" w:colLast="0" w:name="_heading=h.kkx1tet3dg07" w:id="33"/>
+      <w:bookmarkEnd w:id="33"/>
       <w:r>
         <w:rPr>
           <w:rtl w:val="0"/>
@@ -12525,7 +12504,7 @@
 
 <file path=customXML/item1.xml><?xml version="1.0" encoding="utf-8"?>
 <go:gDocsCustomXmlDataStorage xmlns:go="http://customooxmlschemas.google.com/" xmlns:r="http://schemas.openxmlformats.org/officeDocument/2006/relationships" uri="GoogleDocsCustomDataVersion2">
-  <go:docsCustomData xmlns:go="http://customooxmlschemas.google.com/" roundtripDataSignature="AMtx7mjBN8rtaBmFRzcGKKLXglMI/4n2JQ==">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</go:docsCustomData>
+  <go:docsCustomData xmlns:go="http://customooxmlschemas.google.com/" roundtripDataSignature="AMtx7mhfatx3+rKCC8Xtxd7Ds9JB5ykrnA==">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</go:docsCustomData>
 </go:gDocsCustomXmlDataStorage>
 </file>
 

</xml_diff>